<commit_message>
Remove placeholder brackets, fill author contributions, sign AI declarations, remove teammate names from individual transcript
Co-Authored-By: Claude Sonnet 5 <noreply@anthropic.com>
</commit_message>
<xml_diff>
--- a/report/ai_declaration_arnav_jain.docx
+++ b/report/ai_declaration_arnav_jain.docx
@@ -106,25 +106,19 @@
         <w:t xml:space="preserve"> </w:t>
       </w:r>
       <w:r>
-        <w:t xml:space="preserve">- [x] Data cleaning / preprocessing code (delimiter fixes, missing-value handling, derived fields)</w:t>
-      </w:r>
-      <w:r>
-        <w:t xml:space="preserve"> </w:t>
-      </w:r>
-      <w:r>
-        <w:t xml:space="preserve">- [x] Visualization code (Python/matplotlib scripts generating the report’s figures)</w:t>
-      </w:r>
-      <w:r>
-        <w:t xml:space="preserve"> </w:t>
-      </w:r>
-      <w:r>
-        <w:t xml:space="preserve">- [x] Boilerplate repository setup (folder structure, README)</w:t>
-      </w:r>
-      <w:r>
-        <w:t xml:space="preserve"> </w:t>
-      </w:r>
-      <w:r>
-        <w:t xml:space="preserve">- [ ] None</w:t>
+        <w:t xml:space="preserve">- Data cleaning / preprocessing code (delimiter fixes, missing-value handling, derived fields)</w:t>
+      </w:r>
+      <w:r>
+        <w:t xml:space="preserve"> </w:t>
+      </w:r>
+      <w:r>
+        <w:t xml:space="preserve">- Visualization code (Python/matplotlib scripts generating the report’s figures)</w:t>
+      </w:r>
+      <w:r>
+        <w:t xml:space="preserve"> </w:t>
+      </w:r>
+      <w:r>
+        <w:t xml:space="preserve">- Boilerplate repository setup (folder structure, README)</w:t>
       </w:r>
     </w:p>
     <w:p>
@@ -175,18 +169,6 @@
         <w:t xml:space="preserve">scripts based on task-set requirements and variable choices specified by the team. Chart types, variable pairings, and analytical framing (e.g. the pre/post-1980 reporting-bias comparison) were directed by the team; the AI generated the corresponding pandas/matplotlib implementation. Code was reviewed and run to confirm outputs before inclusion in the report.</w:t>
       </w:r>
     </w:p>
-    <w:p>
-      <w:pPr>
-        <w:pStyle w:val="BodyText"/>
-      </w:pPr>
-      <w:r>
-        <w:rPr>
-          <w:i/>
-          <w:iCs/>
-        </w:rPr>
-        <w:t xml:space="preserve">[Each member: if you independently used AI for your own task set’s Tableau work or additional analysis, describe that here specifically.]</w:t>
-      </w:r>
-    </w:p>
     <w:bookmarkEnd w:id="9"/>
     <w:bookmarkStart w:id="10" w:name="report-writing-and-documentation"/>
     <w:p>
@@ -230,25 +212,19 @@
         <w:t xml:space="preserve"> </w:t>
       </w:r>
       <w:r>
-        <w:t xml:space="preserve">- [x] Outlining the report structure and sections</w:t>
-      </w:r>
-      <w:r>
-        <w:t xml:space="preserve"> </w:t>
-      </w:r>
-      <w:r>
-        <w:t xml:space="preserve">- [x] Drafting figure captions, interpretations, and reasoning text</w:t>
-      </w:r>
-      <w:r>
-        <w:t xml:space="preserve"> </w:t>
-      </w:r>
-      <w:r>
-        <w:t xml:space="preserve">- [x] Drafting the Limitations and Conclusions sections</w:t>
-      </w:r>
-      <w:r>
-        <w:t xml:space="preserve"> </w:t>
-      </w:r>
-      <w:r>
-        <w:t xml:space="preserve">- [ ] None</w:t>
+        <w:t xml:space="preserve">- Outlining the report structure and sections</w:t>
+      </w:r>
+      <w:r>
+        <w:t xml:space="preserve"> </w:t>
+      </w:r>
+      <w:r>
+        <w:t xml:space="preserve">- Drafting figure captions, interpretations, and reasoning text</w:t>
+      </w:r>
+      <w:r>
+        <w:t xml:space="preserve"> </w:t>
+      </w:r>
+      <w:r>
+        <w:t xml:space="preserve">- Drafting the Limitations and Conclusions sections</w:t>
       </w:r>
     </w:p>
     <w:p>
@@ -306,13 +282,13 @@
           <w:b/>
           <w:bCs/>
         </w:rPr>
-        <w:t xml:space="preserve">Link to Chat Transcripts (if applicable):</w:t>
-      </w:r>
-      <w:r>
-        <w:t xml:space="preserve"> </w:t>
-      </w:r>
-      <w:r>
-        <w:t xml:space="preserve">[Insert URL here, if your institution requires it]</w:t>
+        <w:t xml:space="preserve">Link to Chat Transcripts:</w:t>
+      </w:r>
+      <w:r>
+        <w:t xml:space="preserve"> </w:t>
+      </w:r>
+      <w:r>
+        <w:t xml:space="preserve">Not applicable.</w:t>
       </w:r>
     </w:p>
     <w:p>
@@ -385,7 +361,7 @@
         <w:t xml:space="preserve"> </w:t>
       </w:r>
       <w:r>
-        <w:t xml:space="preserve">_______________________</w:t>
+        <w:t xml:space="preserve">Arnav Jain</w:t>
       </w:r>
       <w:r>
         <w:t xml:space="preserve"> </w:t>
@@ -401,7 +377,7 @@
         <w:t xml:space="preserve"> </w:t>
       </w:r>
       <w:r>
-        <w:t xml:space="preserve">_______________________</w:t>
+        <w:t xml:space="preserve">September 18, 2026</w:t>
       </w:r>
     </w:p>
     <w:bookmarkEnd w:id="11"/>

</xml_diff>

<commit_message>
Match official DAS732 AI disclosure template structure (4 sections) for all three members
Co-Authored-By: Claude Sonnet 5 <noreply@anthropic.com>
</commit_message>
<xml_diff>
--- a/report/ai_declaration_arnav_jain.docx
+++ b/report/ai_declaration_arnav_jain.docx
@@ -2,43 +2,39 @@
 <file path=word/document.xml><?xml version="1.0" encoding="utf-8"?>
 <w:document xmlns:w="http://schemas.openxmlformats.org/wordprocessingml/2006/main" xmlns:m="http://schemas.openxmlformats.org/officeDocument/2006/math" xmlns:r="http://schemas.openxmlformats.org/officeDocument/2006/relationships" xmlns:o="urn:schemas-microsoft-com:office:office" xmlns:v="urn:schemas-microsoft-com:vml" xmlns:w10="urn:schemas-microsoft-com:office:word" xmlns:a="http://schemas.openxmlformats.org/drawingml/2006/main" xmlns:pic="http://schemas.openxmlformats.org/drawingml/2006/picture" xmlns:wp="http://schemas.openxmlformats.org/drawingml/2006/wordprocessingDrawing">
   <w:body>
-    <w:bookmarkStart w:id="12" w:name="Xe7700713a7a0086f6d26210bf9249bd39b9586a"/>
+    <w:p>
+      <w:pPr>
+        <w:pStyle w:val="FirstParagraph"/>
+      </w:pPr>
+      <w:r>
+        <w:t xml:space="preserve">DAS732 - Term 1 - 2026-27, IIITB</w:t>
+      </w:r>
+    </w:p>
+    <w:bookmarkStart w:id="13" w:name="project-report-ai-disclosure-statement"/>
     <w:p>
       <w:pPr>
         <w:pStyle w:val="Heading1"/>
       </w:pPr>
       <w:r>
-        <w:t xml:space="preserve">AI Disclosure Statement — DAS732 Programming Assignment 1</w:t>
+        <w:t xml:space="preserve">Project &amp; Report AI Disclosure Statement</w:t>
       </w:r>
     </w:p>
     <w:p>
       <w:pPr>
         <w:pStyle w:val="FirstParagraph"/>
-      </w:pPr>
-      <w:r>
-        <w:rPr>
-          <w:i/>
-          <w:iCs/>
-        </w:rPr>
-        <w:t xml:space="preserve">Adapted from the course-provided AI Disclosure Statement template. Each team member submits their own completed copy of this form.</w:t>
-      </w:r>
-    </w:p>
-    <w:p>
-      <w:pPr>
-        <w:pStyle w:val="BodyText"/>
       </w:pPr>
       <w:r>
         <w:rPr>
           <w:b/>
           <w:bCs/>
         </w:rPr>
-        <w:t xml:space="preserve">Team:</w:t>
-      </w:r>
-      <w:r>
-        <w:t xml:space="preserve"> </w:t>
-      </w:r>
-      <w:r>
-        <w:t xml:space="preserve">Pythagoras</w:t>
+        <w:t xml:space="preserve">Name of Student:</w:t>
+      </w:r>
+      <w:r>
+        <w:t xml:space="preserve"> </w:t>
+      </w:r>
+      <w:r>
+        <w:t xml:space="preserve">Arnav Jain</w:t>
       </w:r>
       <w:r>
         <w:t xml:space="preserve"> </w:t>
@@ -48,29 +44,22 @@
           <w:b/>
           <w:bCs/>
         </w:rPr>
-        <w:t xml:space="preserve">Assignment:</w:t>
-      </w:r>
-      <w:r>
-        <w:t xml:space="preserve"> </w:t>
-      </w:r>
-      <w:r>
-        <w:t xml:space="preserve">DAS732 — Programming Assignment A1 (Visual Exploration, EM-DAT Natural Disasters dataset)</w:t>
-      </w:r>
-    </w:p>
-    <w:p>
-      <w:r>
-        <w:pict>
-          <v:rect style="width:0;height:1.5pt" o:hralign="center" o:hrstd="t" o:hr="t"/>
-        </w:pict>
-      </w:r>
-    </w:p>
-    <w:bookmarkStart w:id="9" w:name="Xb91969a77eeafb3b95ab3002edf9deedaf56e88"/>
+        <w:t xml:space="preserve">Roll Number:</w:t>
+      </w:r>
+      <w:r>
+        <w:t xml:space="preserve"> </w:t>
+      </w:r>
+      <w:r>
+        <w:t xml:space="preserve">BT2024233</w:t>
+      </w:r>
+    </w:p>
+    <w:bookmarkStart w:id="9" w:name="code-generation-and-modification"/>
     <w:p>
       <w:pPr>
         <w:pStyle w:val="Heading2"/>
       </w:pPr>
       <w:r>
-        <w:t xml:space="preserve">1. Data Processing, Analysis, and Code Generation</w:t>
+        <w:t xml:space="preserve">1. Code Generation and Modification</w:t>
       </w:r>
     </w:p>
     <w:p>
@@ -88,7 +77,7 @@
         <w:t xml:space="preserve"> </w:t>
       </w:r>
       <w:r>
-        <w:t xml:space="preserve">Claude (Anthropic), used via a coding assistant session.</w:t>
+        <w:t xml:space="preserve">Claude (Anthropic)</w:t>
       </w:r>
     </w:p>
     <w:p>
@@ -170,13 +159,13 @@
       </w:r>
     </w:p>
     <w:bookmarkEnd w:id="9"/>
-    <w:bookmarkStart w:id="10" w:name="report-writing-and-documentation"/>
+    <w:bookmarkStart w:id="10" w:name="d-modeling-and-assets"/>
     <w:p>
       <w:pPr>
         <w:pStyle w:val="Heading2"/>
       </w:pPr>
       <w:r>
-        <w:t xml:space="preserve">2. Report Writing and Documentation</w:t>
+        <w:t xml:space="preserve">2. 3D Modeling and Assets</w:t>
       </w:r>
     </w:p>
     <w:p>
@@ -194,7 +183,7 @@
         <w:t xml:space="preserve"> </w:t>
       </w:r>
       <w:r>
-        <w:t xml:space="preserve">Claude (Anthropic).</w:t>
+        <w:t xml:space="preserve">Not applicable.</w:t>
       </w:r>
     </w:p>
     <w:p>
@@ -212,19 +201,7 @@
         <w:t xml:space="preserve"> </w:t>
       </w:r>
       <w:r>
-        <w:t xml:space="preserve">- Outlining the report structure and sections</w:t>
-      </w:r>
-      <w:r>
-        <w:t xml:space="preserve"> </w:t>
-      </w:r>
-      <w:r>
-        <w:t xml:space="preserve">- Drafting figure captions, interpretations, and reasoning text</w:t>
-      </w:r>
-      <w:r>
-        <w:t xml:space="preserve"> </w:t>
-      </w:r>
-      <w:r>
-        <w:t xml:space="preserve">- Drafting the Limitations and Conclusions sections</w:t>
+        <w:t xml:space="preserve">- None (this assignment does not involve 3D modeling or generated visual assets)</w:t>
       </w:r>
     </w:p>
     <w:p>
@@ -242,17 +219,17 @@
         <w:t xml:space="preserve"> </w:t>
       </w:r>
       <w:r>
-        <w:t xml:space="preserve">The report’s narrative text — figure interpretations, task-set conclusions, and limitations — was drafted by AI based on the computed statistics and chart outputs, then reviewed by the team. The underlying data analysis (which numbers to cite, which comparisons to draw) was directed by the team; the AI’s role was primarily drafting and structuring the written explanation of those results, not independently determining the findings.</w:t>
+        <w:t xml:space="preserve">Not applicable.</w:t>
       </w:r>
     </w:p>
     <w:bookmarkEnd w:id="10"/>
-    <w:bookmarkStart w:id="11" w:name="academic-integrity-verification"/>
+    <w:bookmarkStart w:id="11" w:name="report-writing-and-documentation"/>
     <w:p>
       <w:pPr>
         <w:pStyle w:val="Heading2"/>
       </w:pPr>
       <w:r>
-        <w:t xml:space="preserve">3. Academic Integrity &amp; Verification</w:t>
+        <w:t xml:space="preserve">3. Report Writing and Documentation</w:t>
       </w:r>
     </w:p>
     <w:p>
@@ -264,13 +241,13 @@
           <w:b/>
           <w:bCs/>
         </w:rPr>
-        <w:t xml:space="preserve">Core Analysis &amp; Authorship Statement:</w:t>
-      </w:r>
-      <w:r>
-        <w:t xml:space="preserve"> </w:t>
-      </w:r>
-      <w:r>
-        <w:t xml:space="preserve">I certify that the dataset selection, task-set design, choice of variables, and analytical framing for my task set reflect my own understanding of the assignment and the data. AI assistance was used for code generation and report drafting as described above; I have reviewed the generated code and text and take responsibility for the accuracy and interpretation of the figures and findings attributed to my task set.</w:t>
+        <w:t xml:space="preserve">Tool(s) Used:</w:t>
+      </w:r>
+      <w:r>
+        <w:t xml:space="preserve"> </w:t>
+      </w:r>
+      <w:r>
+        <w:t xml:space="preserve">Claude (Anthropic).</w:t>
       </w:r>
     </w:p>
     <w:p>
@@ -282,58 +259,102 @@
           <w:b/>
           <w:bCs/>
         </w:rPr>
-        <w:t xml:space="preserve">Link to Chat Transcripts:</w:t>
-      </w:r>
-      <w:r>
-        <w:t xml:space="preserve"> </w:t>
-      </w:r>
-      <w:r>
-        <w:t xml:space="preserve">Not applicable.</w:t>
-      </w:r>
-    </w:p>
-    <w:p>
-      <w:r>
-        <w:pict>
-          <v:rect style="width:0;height:1.5pt" o:hralign="center" o:hrstd="t" o:hr="t"/>
-        </w:pict>
-      </w:r>
-    </w:p>
-    <w:p>
-      <w:pPr>
-        <w:pStyle w:val="FirstParagraph"/>
+        <w:t xml:space="preserve">Specific Applications:</w:t>
+      </w:r>
+      <w:r>
+        <w:t xml:space="preserve"> </w:t>
+      </w:r>
+      <w:r>
+        <w:t xml:space="preserve">- Outlining the report structure and sections</w:t>
+      </w:r>
+      <w:r>
+        <w:t xml:space="preserve"> </w:t>
+      </w:r>
+      <w:r>
+        <w:t xml:space="preserve">- Drafting figure captions, interpretations, and reasoning text</w:t>
+      </w:r>
+      <w:r>
+        <w:t xml:space="preserve"> </w:t>
+      </w:r>
+      <w:r>
+        <w:t xml:space="preserve">- Drafting the Limitations and Conclusions sections</w:t>
+      </w:r>
+    </w:p>
+    <w:p>
+      <w:pPr>
+        <w:pStyle w:val="BodyText"/>
       </w:pPr>
       <w:r>
         <w:rPr>
           <w:b/>
           <w:bCs/>
         </w:rPr>
-        <w:t xml:space="preserve">Name:</w:t>
-      </w:r>
-      <w:r>
-        <w:t xml:space="preserve"> </w:t>
-      </w:r>
-      <w:r>
-        <w:t xml:space="preserve">Arnav Jain</w:t>
-      </w:r>
-      <w:r>
-        <w:t xml:space="preserve"> </w:t>
-      </w:r>
+        <w:t xml:space="preserve">Description of AI Involvement:</w:t>
+      </w:r>
+      <w:r>
+        <w:t xml:space="preserve"> </w:t>
+      </w:r>
+      <w:r>
+        <w:t xml:space="preserve">The report’s narrative text — figure interpretations, task-set conclusions, and limitations — was drafted by AI based on the computed statistics and chart outputs, then reviewed by the team. The underlying data analysis (which numbers to cite, which comparisons to draw) was directed by the team; the AI’s role was primarily drafting and structuring the written explanation of those results, not independently determining the findings.</w:t>
+      </w:r>
+    </w:p>
+    <w:bookmarkEnd w:id="11"/>
+    <w:bookmarkStart w:id="12" w:name="academic-integrity-verification"/>
+    <w:p>
+      <w:pPr>
+        <w:pStyle w:val="Heading2"/>
+      </w:pPr>
+      <w:r>
+        <w:t xml:space="preserve">4. Academic Integrity &amp; Verification</w:t>
+      </w:r>
+    </w:p>
+    <w:p>
+      <w:pPr>
+        <w:pStyle w:val="FirstParagraph"/>
+      </w:pPr>
       <w:r>
         <w:rPr>
           <w:b/>
           <w:bCs/>
         </w:rPr>
-        <w:t xml:space="preserve">Roll Number:</w:t>
-      </w:r>
-      <w:r>
-        <w:t xml:space="preserve"> </w:t>
-      </w:r>
-      <w:r>
-        <w:t xml:space="preserve">BT2024233</w:t>
-      </w:r>
-      <w:r>
-        <w:t xml:space="preserve"> </w:t>
-      </w:r>
+        <w:t xml:space="preserve">Core Logic &amp; Authorship Statement:</w:t>
+      </w:r>
+      <w:r>
+        <w:t xml:space="preserve"> </w:t>
+      </w:r>
+      <w:r>
+        <w:t xml:space="preserve">I certify that the dataset selection, task-set design, choice of variables, and analytical framing for my task set reflect my own understanding of the assignment and the data. Furthermore, the analysis, conclusions, and technical evaluations presented in the report reflect my own understanding of the material. AI tools were used for supplemental code generation, report drafting, and editing as described above; I have reviewed the generated code and text and take responsibility for the accuracy and interpretation of the figures and findings attributed to my task set.</w:t>
+      </w:r>
+    </w:p>
+    <w:p>
+      <w:pPr>
+        <w:pStyle w:val="BodyText"/>
+      </w:pPr>
+      <w:r>
+        <w:rPr>
+          <w:b/>
+          <w:bCs/>
+        </w:rPr>
+        <w:t xml:space="preserve">Link to Chat Transcripts (If applicable):</w:t>
+      </w:r>
+      <w:r>
+        <w:t xml:space="preserve"> </w:t>
+      </w:r>
+      <w:r>
+        <w:t xml:space="preserve">Not applicable.</w:t>
+      </w:r>
+    </w:p>
+    <w:p>
+      <w:r>
+        <w:pict>
+          <v:rect style="width:0;height:1.5pt" o:hralign="center" o:hrstd="t" o:hr="t"/>
+        </w:pict>
+      </w:r>
+    </w:p>
+    <w:p>
+      <w:pPr>
+        <w:pStyle w:val="FirstParagraph"/>
+      </w:pPr>
       <w:r>
         <w:rPr>
           <w:b/>
@@ -380,8 +401,8 @@
         <w:t xml:space="preserve">September 18, 2026</w:t>
       </w:r>
     </w:p>
-    <w:bookmarkEnd w:id="11"/>
     <w:bookmarkEnd w:id="12"/>
+    <w:bookmarkEnd w:id="13"/>
     <w:sectPr>
       <w:footnotePr>
         <w:numRestart w:val="eachSect"/>

</xml_diff>